<commit_message>
docs: simplify student material language
</commit_message>
<xml_diff>
--- a/methodical-development/Project_case_students.docx
+++ b/methodical-development/Project_case_students.docx
@@ -32,7 +32,7 @@
           <w:color w:val="000000"/>
           <w:sz w:val="24"/>
         </w:rPr>
-        <w:t>Кейс для команды учащихся 11 класса</w:t>
+        <w:t>Задание для команды 11 класса</w:t>
       </w:r>
     </w:p>
     <w:p>
@@ -49,7 +49,7 @@
           <w:color w:val="000000"/>
           <w:sz w:val="22"/>
         </w:rPr>
-        <w:t>За два занятия вы исследуете собственные решения в тренажёре и создадите диагностический маршрут, которым сможет воспользоваться другая команда без пояснений авторов.</w:t>
+        <w:t>За два занятия вы сравните несколько способов решения задач в тренажёре. Затем создадите диагностический маршрут — понятную схему, которая поможет другой команде выбрать способ решения без ваших устных подсказок.</w:t>
       </w:r>
     </w:p>
     <w:tbl>
@@ -227,7 +227,7 @@
           <w:color w:val="000000"/>
           <w:sz w:val="30"/>
         </w:rPr>
-        <w:t>Ситуация и заказчик</w:t>
+        <w:t>Задача команды</w:t>
       </w:r>
     </w:p>
     <w:p>
@@ -244,7 +244,7 @@
           <w:color w:val="000000"/>
           <w:sz w:val="21"/>
         </w:rPr>
-        <w:t>Вы — команда образовательных аналитиков. Школьное методическое объединение учителей информатики готовит следующую группу выпускников к заданию 12 КЕГЭ и хочет уменьшить число ошибок, возникающих из-за механической полной трассировки.</w:t>
+        <w:t>Заказчик проекта — школьное объединение учителей информатики. Учителя хотят помочь следующей группе выпускников реже ошибаться в задании 12 КЕГЭ, особенно в длинных задачах с полной пошаговой трассировкой.</w:t>
       </w:r>
     </w:p>
     <w:p>
@@ -254,7 +254,7 @@
         <w:jc w:val="both"/>
       </w:pPr>
       <w:r>
-        <w:t>У вас два занятия по 45 минут. Выполните одну входную задачу привычным способом, затем сравните две заранее назначенные стратегии на структурно парных задачах сопоставимой сложности. Разработайте диагностический маршрут, который поможет другому ученику выбрать между полной трассировкой, несколькими проверочными шагами и аналитическим решением. Подтвердите рекомендации данными, разберите не менее трёх типичных ошибок и проверьте маршрут на другой команде. Если вы используете ИИ, приложите запрос и протокол проверки его ответа.</w:t>
+        <w:t>У вас два занятия по 45 минут. Сначала решите входную задачу привычным способом. Затем сравните две назначенные стратегии на двух похожих задачах одного типа и примерно одинаковой сложности. Составьте маршрут, который поможет выбрать полную трассировку, несколько проверочных шагов или аналитическое решение по найденной закономерности. Используйте данные своих попыток, разберите не менее трёх типичных ошибок и отдайте маршрут другой команде на проверку. Если обращались к ИИ, приложите запрос и покажите, как проверили его ответ.</w:t>
       </w:r>
     </w:p>
     <w:p>
@@ -271,7 +271,7 @@
           <w:color w:val="000000"/>
           <w:sz w:val="30"/>
         </w:rPr>
-        <w:t>Проектный вопрос</w:t>
+        <w:t>Главный вопрос проекта</w:t>
       </w:r>
     </w:p>
     <w:p>
@@ -288,7 +288,7 @@
           <w:color w:val="000000"/>
           <w:sz w:val="21"/>
         </w:rPr>
-        <w:t>Как по данным собственных решений определить, когда пошаговая симуляция помогает, а когда пора переходить к аналитическому решению, и создать понятный маршрут для другого ученика?</w:t>
+        <w:t>Как понять по своим попыткам, когда нужно выполнить все шаги, а когда достаточно найти закономерность и решить задачу без полной трассировки? Как объяснить этот выбор другому ученику?</w:t>
       </w:r>
     </w:p>
     <w:p>
@@ -323,7 +323,7 @@
           <w:color w:val="000000"/>
           <w:sz w:val="21"/>
         </w:rPr>
-        <w:t>• диагностический маршрут выбора стратегии;</w:t>
+        <w:t>• диагностический маршрут — схему выбора способа решения;</w:t>
       </w:r>
     </w:p>
     <w:p>
@@ -334,7 +334,7 @@
         <w:jc w:val="left"/>
       </w:pPr>
       <w:r>
-        <w:t>• данные свободной входной попытки и двух сопоставимых попыток по назначенным стратегиям;</w:t>
+        <w:t>• записи о входной попытке и двух похожих задачах, решённых назначенными способами;</w:t>
       </w:r>
     </w:p>
     <w:p>
@@ -352,7 +352,7 @@
           <w:color w:val="000000"/>
           <w:sz w:val="21"/>
         </w:rPr>
-        <w:t>• разбор закономерности, цикла или инварианта хотя бы одной машины;</w:t>
+        <w:t>• объяснение закономерности, цикла или инварианта — того, что не меняется, — хотя бы для одной машины;</w:t>
       </w:r>
     </w:p>
     <w:p>
@@ -370,7 +370,7 @@
           <w:color w:val="000000"/>
           <w:sz w:val="21"/>
         </w:rPr>
-        <w:t>• карту не менее чем из трёх типичных ошибок и способов их исправления;</w:t>
+        <w:t>• таблицу минимум из трёх типичных ошибок и способов их исправления;</w:t>
       </w:r>
     </w:p>
     <w:p>
@@ -388,7 +388,7 @@
           <w:color w:val="000000"/>
           <w:sz w:val="21"/>
         </w:rPr>
-        <w:t>• проверочный пример с кратким обоснованием ответа;</w:t>
+        <w:t>• проверочный пример с коротким объяснением ответа;</w:t>
       </w:r>
     </w:p>
     <w:p>
@@ -406,7 +406,7 @@
           <w:color w:val="000000"/>
           <w:sz w:val="21"/>
         </w:rPr>
-        <w:t>• лист перекрёстной проверки другой команды;</w:t>
+        <w:t>• лист проверки другой команды;</w:t>
       </w:r>
     </w:p>
     <w:p>
@@ -424,7 +424,7 @@
           <w:color w:val="000000"/>
           <w:sz w:val="21"/>
         </w:rPr>
-        <w:t>• протокол проверки результата ИИ, если ИИ использовался.</w:t>
+        <w:t>• запрос к ИИ и результат проверки его ответа, если ИИ использовался.</w:t>
       </w:r>
     </w:p>
     <w:p>
@@ -446,7 +446,7 @@
           <w:color w:val="000000"/>
           <w:sz w:val="44"/>
         </w:rPr>
-        <w:t>Организация работы команды</w:t>
+        <w:t>Как организовать работу</w:t>
       </w:r>
     </w:p>
     <w:p>
@@ -462,7 +462,7 @@
           <w:color w:val="000000"/>
           <w:sz w:val="24"/>
         </w:rPr>
-        <w:t>Роли и пять спринтов</w:t>
+        <w:t>Роли и пять этапов</w:t>
       </w:r>
     </w:p>
     <w:p>
@@ -563,7 +563,7 @@
                 <w:color w:val="000000"/>
                 <w:sz w:val="19"/>
               </w:rPr>
-              <w:t>Зона ответственности</w:t>
+              <w:t>Что делает</w:t>
             </w:r>
           </w:p>
         </w:tc>
@@ -657,7 +657,7 @@
                 <w:color w:val="000000"/>
                 <w:sz w:val="19"/>
               </w:rPr>
-              <w:t>Формулирует закономерность или инвариант и следит за обоснованием.</w:t>
+              <w:t>Ищет закономерность или инвариант — то, что не меняется, — и проверяет объяснение.</w:t>
             </w:r>
           </w:p>
         </w:tc>
@@ -749,7 +749,7 @@
                 <w:color w:val="000000"/>
                 <w:sz w:val="19"/>
               </w:rPr>
-              <w:t>Подбирает обычные и граничные примеры, фиксирует несоответствия.</w:t>
+              <w:t>Подбирает обычные и граничные примеры, замечает, где правило не работает.</w:t>
             </w:r>
           </w:p>
         </w:tc>
@@ -817,7 +817,7 @@
           </w:tcPr>
           <w:p>
             <w:r>
-              <w:t>Ведёт протокол попыток, проверяет постоянство условий и отделяет наблюдение от гипотезы о причине.</w:t>
+              <w:t>Записывает результаты попыток, следит за одинаковыми условиями и отделяет факты от предположений.</w:t>
             </w:r>
           </w:p>
         </w:tc>
@@ -896,7 +896,7 @@
                 <w:color w:val="000000"/>
                 <w:sz w:val="19"/>
               </w:rPr>
-              <w:t>Собирает материалы в понятный диагностический маршрут.</w:t>
+              <w:t>Собирает материалы в понятный маршрут решения.</w:t>
             </w:r>
           </w:p>
         </w:tc>
@@ -988,7 +988,7 @@
                 <w:color w:val="000000"/>
                 <w:sz w:val="19"/>
               </w:rPr>
-              <w:t>Представляет решение и демонстрирует продукт.</w:t>
+              <w:t>Представляет решение и показывает, как пользоваться маршрутом.</w:t>
             </w:r>
           </w:p>
         </w:tc>
@@ -1041,7 +1041,7 @@
           <w:color w:val="000000"/>
           <w:sz w:val="19"/>
         </w:rPr>
-        <w:t>Если в команде четыре человека, редактор совмещает роль спикера. Если три человека, аналитик данных совмещает роль тестировщика.</w:t>
+        <w:t>Если в команде четыре человека, редактор также становится спикером. Если три — аналитик данных также выполняет работу тестировщика.</w:t>
       </w:r>
     </w:p>
     <w:p>
@@ -1058,7 +1058,7 @@
           <w:color w:val="000000"/>
           <w:sz w:val="30"/>
         </w:rPr>
-        <w:t>Пять спринтов</w:t>
+        <w:t>Пять этапов</w:t>
       </w:r>
     </w:p>
     <w:tbl>
@@ -1112,7 +1112,7 @@
                 <w:color w:val="000000"/>
                 <w:sz w:val="19"/>
               </w:rPr>
-              <w:t>Спринт</w:t>
+              <w:t>Этап</w:t>
             </w:r>
           </w:p>
         </w:tc>
@@ -1172,7 +1172,7 @@
                 <w:color w:val="000000"/>
                 <w:sz w:val="19"/>
               </w:rPr>
-              <w:t>Результат</w:t>
+              <w:t>Что должно получиться</w:t>
             </w:r>
           </w:p>
         </w:tc>
@@ -1207,7 +1207,7 @@
                 <w:color w:val="000000"/>
                 <w:sz w:val="19"/>
               </w:rPr>
-              <w:t>1 Исходная стратегия</w:t>
+              <w:t>1 Первый способ решения</w:t>
             </w:r>
           </w:p>
         </w:tc>
@@ -1265,7 +1265,7 @@
                 <w:color w:val="000000"/>
                 <w:sz w:val="19"/>
               </w:rPr>
-              <w:t>Входная гипотеза и результат первой попытки</w:t>
+              <w:t>Запись о том, как команда обычно решает задачу</w:t>
             </w:r>
           </w:p>
         </w:tc>
@@ -1288,7 +1288,7 @@
           </w:tcPr>
           <w:p>
             <w:r>
-              <w:t>2 Контролируемое сравнение</w:t>
+              <w:t>2 Честное сравнение</w:t>
             </w:r>
           </w:p>
         </w:tc>
@@ -1322,7 +1322,7 @@
           </w:tcPr>
           <w:p>
             <w:r>
-              <w:t>Протокол двух сопоставимых попыток и трёхчастный вывод</w:t>
+              <w:t>Результаты двух похожих задач, решённых разными способами</w:t>
             </w:r>
           </w:p>
         </w:tc>
@@ -1345,7 +1345,7 @@
           </w:tcPr>
           <w:p>
             <w:r>
-              <w:t>3 Закономерность</w:t>
+              <w:t>3 Поиск закономерности</w:t>
             </w:r>
           </w:p>
         </w:tc>
@@ -1379,7 +1379,7 @@
           </w:tcPr>
           <w:p>
             <w:r>
-              <w:t>Проверка причинной гипотезы и правила выбора стратегии</w:t>
+              <w:t>Проверенное объяснение и правило выбора способа</w:t>
             </w:r>
           </w:p>
         </w:tc>
@@ -1472,7 +1472,7 @@
                 <w:color w:val="000000"/>
                 <w:sz w:val="19"/>
               </w:rPr>
-              <w:t>Первая версия диагностического маршрута</w:t>
+              <w:t>Первая версия маршрута</w:t>
             </w:r>
           </w:p>
         </w:tc>
@@ -1507,7 +1507,7 @@
                 <w:color w:val="000000"/>
                 <w:sz w:val="19"/>
               </w:rPr>
-              <w:t>5 Перекрёстная проверка</w:t>
+              <w:t>5 Проверка другой командой</w:t>
             </w:r>
           </w:p>
         </w:tc>
@@ -1590,7 +1590,7 @@
           <w:color w:val="000000"/>
           <w:sz w:val="30"/>
         </w:rPr>
-        <w:t>Правило использования тренажёра</w:t>
+        <w:t>Как использовать тренажёр</w:t>
       </w:r>
     </w:p>
     <w:p>
@@ -1600,7 +1600,7 @@
         <w:jc w:val="both"/>
       </w:pPr>
       <w:r>
-        <w:t>Тренажёр нужен как исследовательский стенд: он помогает проверить несколько шагов, собрать данные и найти место ошибки. Входная попытка показывает ваш обычный способ работы и не доказывает, что одна стратегия лучше другой. Для прямого сравнения используйте только попытки 2 и 3: не меняйте назначенную стратегию и сохраняйте одинаковыми исполнителя, лимит времени и доступ к подсказкам. Итоговое объяснение команда формулирует сама и подтверждает примером.</w:t>
+        <w:t>Тренажёр помогает проверить несколько шагов, собрать результаты и найти место ошибки. Входная попытка показывает ваш обычный способ решения, но по ней нельзя определить, какая стратегия лучше. Сравнивайте только попытки 2 и 3. Для честного сравнения не меняйте назначенную стратегию, исполнителя, время и доступ к подсказкам. Вывод сформулируйте сами и подтвердите примером.</w:t>
       </w:r>
     </w:p>
     <w:p>
@@ -1622,7 +1622,7 @@
           <w:color w:val="000000"/>
           <w:sz w:val="44"/>
         </w:rPr>
-        <w:t>Критерии готовности продукта</w:t>
+        <w:t>Как понять, что маршрут готов</w:t>
       </w:r>
     </w:p>
     <w:p>
@@ -1638,7 +1638,7 @@
           <w:color w:val="000000"/>
           <w:sz w:val="24"/>
         </w:rPr>
-        <w:t>Самопроверка перед передачей другой команде</w:t>
+        <w:t>Проверьте маршрут перед передачей другой команде</w:t>
       </w:r>
     </w:p>
     <w:p>
@@ -1655,7 +1655,7 @@
           <w:color w:val="000000"/>
           <w:sz w:val="30"/>
         </w:rPr>
-        <w:t>Обязательные признаки</w:t>
+        <w:t>В готовом маршруте</w:t>
       </w:r>
     </w:p>
     <w:p>
@@ -1672,7 +1672,7 @@
           <w:color w:val="000000"/>
           <w:sz w:val="20"/>
         </w:rPr>
-        <w:t>[ ] По маршруту понятно, с какого вопроса начать анализ машины.</w:t>
+        <w:t>[ ] Понятно, с какого вопроса начать разбор машины.</w:t>
       </w:r>
     </w:p>
     <w:p>
@@ -1689,7 +1689,7 @@
           <w:color w:val="000000"/>
           <w:sz w:val="20"/>
         </w:rPr>
-        <w:t>[ ] Для каждой из трёх стратегий указаны признаки выбора и объяснение.</w:t>
+        <w:t>[ ] Для каждого из трёх способов указано, когда его выбирать и почему.</w:t>
       </w:r>
     </w:p>
     <w:p>
@@ -1699,7 +1699,7 @@
         <w:jc w:val="left"/>
       </w:pPr>
       <w:r>
-        <w:t>[ ] Для попыток 2 и 3 записаны сопоставимость задач, назначенные стратегии и одинаковые условия; наблюдение отделено от гипотезы о причине и её проверки.</w:t>
+        <w:t>[ ] Для попыток 2 и 3 указано, чем задачи похожи, какие стратегии назначены и какие условия оставались одинаковыми. Отдельно записано, что вы увидели, почему так могло получиться и как это проверили.</w:t>
       </w:r>
     </w:p>
     <w:p>
@@ -1716,7 +1716,7 @@
           <w:color w:val="000000"/>
           <w:sz w:val="20"/>
         </w:rPr>
-        <w:t>[ ] Разобраны не менее трёх ошибок и названы способы их обнаружения.</w:t>
+        <w:t>[ ] Разобраны не менее трёх ошибок: как их заметить и исправить.</w:t>
       </w:r>
     </w:p>
     <w:p>
@@ -1733,7 +1733,7 @@
           <w:color w:val="000000"/>
           <w:sz w:val="20"/>
         </w:rPr>
-        <w:t>[ ] Есть обычный и граничный пример проверки закономерности.</w:t>
+        <w:t>[ ] Закономерность проверена на обычном и граничном примерах.</w:t>
       </w:r>
     </w:p>
     <w:p>
@@ -1750,7 +1750,7 @@
           <w:color w:val="000000"/>
           <w:sz w:val="20"/>
         </w:rPr>
-        <w:t>[ ] Другая команда применила маршрут без устных пояснений авторов.</w:t>
+        <w:t>[ ] Другая команда смогла применить маршрут без устных подсказок авторов.</w:t>
       </w:r>
     </w:p>
     <w:p>
@@ -1767,7 +1767,7 @@
           <w:color w:val="000000"/>
           <w:sz w:val="20"/>
         </w:rPr>
-        <w:t>[ ] Если использовался ИИ, его содержательное утверждение проверено.</w:t>
+        <w:t>[ ] Если использовался ИИ, хотя бы одно его утверждение проверено.</w:t>
       </w:r>
     </w:p>
     <w:p>
@@ -1867,7 +1867,7 @@
                 <w:color w:val="000000"/>
                 <w:sz w:val="19"/>
               </w:rPr>
-              <w:t>Что должно быть видно в продукте</w:t>
+              <w:t>Что должно быть в работе</w:t>
             </w:r>
           </w:p>
         </w:tc>
@@ -1931,7 +1931,7 @@
                 <w:color w:val="000000"/>
                 <w:sz w:val="19"/>
               </w:rPr>
-              <w:t>Команды выполняются по состоянию и символу; порядок действий не нарушен.</w:t>
+              <w:t>Команды выбраны по состоянию и символу. Порядок действий не нарушен.</w:t>
             </w:r>
           </w:p>
         </w:tc>
@@ -1971,7 +1971,7 @@
           </w:tcPr>
           <w:p>
             <w:r>
-              <w:t>Входная попытка отделена от контролируемой пары; наблюдение, гипотеза о причине и последующая проверка различены.</w:t>
+              <w:t>Входная попытка не смешана с двумя сравниваемыми попытками. Понятно, что вы увидели, что предположили и как проверили.</w:t>
             </w:r>
           </w:p>
         </w:tc>
@@ -2006,7 +2006,7 @@
                 <w:color w:val="000000"/>
                 <w:sz w:val="19"/>
               </w:rPr>
-              <w:t>Выбор стратегии</w:t>
+              <w:t>Выбор способа</w:t>
             </w:r>
           </w:p>
         </w:tc>
@@ -2035,7 +2035,7 @@
                 <w:color w:val="000000"/>
                 <w:sz w:val="19"/>
               </w:rPr>
-              <w:t>Понятно, когда применять полную трассировку, частичную симуляцию или анализ.</w:t>
+              <w:t>Понятно, когда выполнять полную трассировку, делать несколько проверочных шагов или решать задачу аналитически.</w:t>
             </w:r>
           </w:p>
         </w:tc>
@@ -2070,7 +2070,7 @@
                 <w:color w:val="000000"/>
                 <w:sz w:val="19"/>
               </w:rPr>
-              <w:t>Диагностическая полезность</w:t>
+              <w:t>Работа с ошибками</w:t>
             </w:r>
           </w:p>
         </w:tc>
@@ -2099,7 +2099,7 @@
                 <w:color w:val="000000"/>
                 <w:sz w:val="19"/>
               </w:rPr>
-              <w:t>Ошибки связаны с наблюдаемыми признаками и конкретными действиями по исправлению.</w:t>
+              <w:t>Для каждой ошибки указано, как её заметить и что исправить.</w:t>
             </w:r>
           </w:p>
         </w:tc>
@@ -2134,7 +2134,7 @@
                 <w:color w:val="000000"/>
                 <w:sz w:val="19"/>
               </w:rPr>
-              <w:t>Проверяемость</w:t>
+              <w:t>Понятность для другой команды</w:t>
             </w:r>
           </w:p>
         </w:tc>
@@ -2163,7 +2163,7 @@
                 <w:color w:val="000000"/>
                 <w:sz w:val="19"/>
               </w:rPr>
-              <w:t>Другая команда может воспроизвести ход решения и проверить выводы.</w:t>
+              <w:t>Другая команда может повторить ход решения и проверить выводы.</w:t>
             </w:r>
           </w:p>
         </w:tc>
@@ -2205,7 +2205,7 @@
           <w:color w:val="000000"/>
           <w:sz w:val="21"/>
         </w:rPr>
-        <w:t>Используйте автономную версию тренажёра. Если компьютер недоступен, работайте по распечатанным таблицам команд и фиксируйте шаги вручную. Структура продукта и критерии не меняются.</w:t>
+        <w:t>Используйте автономную версию тренажёра. Если компьютера нет, работайте с распечатанными таблицами команд и записывайте шаги вручную. Задание и критерии остаются прежними.</w:t>
       </w:r>
     </w:p>
     <w:p>
@@ -2222,7 +2222,7 @@
           <w:color w:val="000000"/>
           <w:sz w:val="21"/>
         </w:rPr>
-        <w:t>Первое решение команды</w:t>
+        <w:t>Первый план команды Запишите, с чего начнёте и почему</w:t>
       </w:r>
       <w:r>
         <w:rPr>
@@ -2232,7 +2232,6 @@
           <w:color w:val="000000"/>
           <w:sz w:val="19"/>
         </w:rPr>
-        <w:t xml:space="preserve">  Запишите, с чего начнёте и почему</w:t>
       </w:r>
     </w:p>
     <w:tbl>

</xml_diff>